<commit_message>
Offers comparison: consider Complyport Level Three only
Co-Authored-By: Claude Opus 5.5 <noreply@anthropic.com>
Claude-Session: https://claude.ai/code/session_01B5RNGs6XtNXKFMQvGGhdBf
</commit_message>
<xml_diff>
--- a/hypergate/Hypergate_FCA_offers_comparison.docx
+++ b/hypergate/Hypergate_FCA_offers_comparison.docx
@@ -75,7 +75,7 @@
           <w:sz w:val="20"/>
           <w:szCs w:val="20"/>
         </w:rPr>
-        <w:t xml:space="preserve">(£25–42k), но это предварительная оценка, ни к чему не обязывающая. Ответы на запросы FCA и собеседования оплачиваются отдельно.</w:t>
+        <w:t xml:space="preserve">— рассматриваем только Level Three: £38–42k + PERG £4.2k, реально ≈ £50–56k. Но это предварительная оценка, ни к чему не обязывающая. Ответы на запросы FCA сверх 2 раундов и собеседования оплачиваются отдельно.</w:t>
       </w:r>
     </w:p>
     <w:p>
@@ -159,7 +159,7 @@
           <w:sz w:val="20"/>
           <w:szCs w:val="20"/>
         </w:rPr>
-        <w:t xml:space="preserve">провести финальные звонки с ComplyCraft и Fintheo, Complyport оставить как бюджетный вариант (Level Three). Выбирать по ответам на вопросы из раздела 6. Решение нужно принять до начала ноября: на подготовку у всех уходит около 13 недель, а подать нужно до 28.02.2027.</w:t>
+        <w:t xml:space="preserve">провести финальные звонки с ComplyCraft и Fintheo, Complyport (Level Three) оставить как бюджетный вариант. Выбирать по ответам на вопросы из раздела 7. Решение нужно принять до начала ноября: на подготовку у всех уходит около 13 недель, а подать нужно до 28.02.2027.</w:t>
       </w:r>
     </w:p>
     <w:p>
@@ -504,37 +504,27 @@
                 <w:sz w:val="18"/>
                 <w:szCs w:val="18"/>
               </w:rPr>
-              <w:t xml:space="preserve">Level 1: £16–20k</w:t>
-            </w:r>
-          </w:p>
-          <w:p>
-            <w:r>
-              <w:rPr>
-                <w:rFonts w:ascii="Arial" w:cs="Arial" w:eastAsia="Arial" w:hAnsi="Arial"/>
-                <w:sz w:val="18"/>
-                <w:szCs w:val="18"/>
-              </w:rPr>
-              <w:t xml:space="preserve">Level 2: £25–30k</w:t>
-            </w:r>
-          </w:p>
-          <w:p>
-            <w:r>
-              <w:rPr>
-                <w:rFonts w:ascii="Arial" w:cs="Arial" w:eastAsia="Arial" w:hAnsi="Arial"/>
-                <w:sz w:val="18"/>
-                <w:szCs w:val="18"/>
-              </w:rPr>
-              <w:t xml:space="preserve">Level 3: £38–42k</w:t>
-            </w:r>
-          </w:p>
-          <w:p>
-            <w:r>
-              <w:rPr>
-                <w:rFonts w:ascii="Arial" w:cs="Arial" w:eastAsia="Arial" w:hAnsi="Arial"/>
-                <w:sz w:val="18"/>
-                <w:szCs w:val="18"/>
-              </w:rPr>
-              <w:t xml:space="preserve">+ PERG £2.8–4.2k</w:t>
+              <w:t xml:space="preserve">Level Three: £38–42k</w:t>
+            </w:r>
+          </w:p>
+          <w:p>
+            <w:r>
+              <w:rPr>
+                <w:rFonts w:ascii="Arial" w:cs="Arial" w:eastAsia="Arial" w:hAnsi="Arial"/>
+                <w:sz w:val="18"/>
+                <w:szCs w:val="18"/>
+              </w:rPr>
+              <w:t xml:space="preserve">+ PERG £4.2k</w:t>
+            </w:r>
+          </w:p>
+          <w:p>
+            <w:r>
+              <w:rPr>
+                <w:rFonts w:ascii="Arial" w:cs="Arial" w:eastAsia="Arial" w:hAnsi="Arial"/>
+                <w:sz w:val="18"/>
+                <w:szCs w:val="18"/>
+              </w:rPr>
+              <w:t xml:space="preserve">= £42–46k</w:t>
             </w:r>
           </w:p>
         </w:tc>
@@ -694,7 +684,7 @@
                 <w:sz w:val="18"/>
                 <w:szCs w:val="18"/>
               </w:rPr>
-              <w:t xml:space="preserve">≈ £40–55k</w:t>
+              <w:t xml:space="preserve">≈ £50–56k</w:t>
             </w:r>
           </w:p>
         </w:tc>
@@ -1047,7 +1037,7 @@
                 <w:sz w:val="18"/>
                 <w:szCs w:val="18"/>
               </w:rPr>
-              <w:t xml:space="preserve">Level 2–3 — да; Level 1 — нет</w:t>
+              <w:t xml:space="preserve">Да, весь пакет + операционные документы (BCP, план сворачивания)</w:t>
             </w:r>
           </w:p>
         </w:tc>
@@ -1164,7 +1154,7 @@
                 <w:sz w:val="18"/>
                 <w:szCs w:val="18"/>
               </w:rPr>
-              <w:t xml:space="preserve">3 часа (L2–3)</w:t>
+              <w:t xml:space="preserve">3 часа</w:t>
             </w:r>
           </w:p>
         </w:tc>
@@ -1267,32 +1257,22 @@
               <w:bottom w:val="single" w:color="BFBFBF" w:sz="4"/>
               <w:right w:val="single" w:color="BFBFBF" w:sz="4"/>
             </w:tcBorders>
-            <w:shd w:fill="FCE4D6" w:color="auto" w:val="clear"/>
-            <w:tcMar>
-              <w:top w:type="dxa" w:w="60"/>
-              <w:left w:type="dxa" w:w="100"/>
-              <w:bottom w:type="dxa" w:w="60"/>
-              <w:right w:type="dxa" w:w="100"/>
-            </w:tcMar>
-          </w:tcPr>
-          <w:p>
-            <w:r>
-              <w:rPr>
-                <w:rFonts w:ascii="Arial" w:cs="Arial" w:eastAsia="Arial" w:hAnsi="Arial"/>
-                <w:sz w:val="18"/>
-                <w:szCs w:val="18"/>
-              </w:rPr>
-              <w:t xml:space="preserve">L2: 1 раунд до 10 ч</w:t>
-            </w:r>
-          </w:p>
-          <w:p>
-            <w:r>
-              <w:rPr>
-                <w:rFonts w:ascii="Arial" w:cs="Arial" w:eastAsia="Arial" w:hAnsi="Arial"/>
-                <w:sz w:val="18"/>
-                <w:szCs w:val="18"/>
-              </w:rPr>
-              <w:t xml:space="preserve">L3: 2 раунда по 10 ч</w:t>
+            <w:shd w:fill="FFF2CC" w:color="auto" w:val="clear"/>
+            <w:tcMar>
+              <w:top w:type="dxa" w:w="60"/>
+              <w:left w:type="dxa" w:w="100"/>
+              <w:bottom w:type="dxa" w:w="60"/>
+              <w:right w:type="dxa" w:w="100"/>
+            </w:tcMar>
+          </w:tcPr>
+          <w:p>
+            <w:r>
+              <w:rPr>
+                <w:rFonts w:ascii="Arial" w:cs="Arial" w:eastAsia="Arial" w:hAnsi="Arial"/>
+                <w:sz w:val="18"/>
+                <w:szCs w:val="18"/>
+              </w:rPr>
+              <w:t xml:space="preserve">2 раунда по 10 ч</w:t>
             </w:r>
           </w:p>
           <w:p>
@@ -2265,7 +2245,7 @@
                 <w:sz w:val="18"/>
                 <w:szCs w:val="18"/>
               </w:rPr>
-              <w:t xml:space="preserve">PERG Review — письмо-резюме</w:t>
+              <w:t xml:space="preserve">PERG Review — формальный отчёт</w:t>
             </w:r>
           </w:p>
         </w:tc>
@@ -2292,7 +2272,7 @@
                 <w:sz w:val="18"/>
                 <w:szCs w:val="18"/>
               </w:rPr>
-              <w:t xml:space="preserve">£2,800 (8 ч × £350)</w:t>
+              <w:t xml:space="preserve">£4,200 (12 ч × £350)</w:t>
             </w:r>
           </w:p>
         </w:tc>
@@ -2328,7 +2308,7 @@
                 <w:sz w:val="18"/>
                 <w:szCs w:val="18"/>
               </w:rPr>
-              <w:t xml:space="preserve">PERG Review — формальный отчёт</w:t>
+              <w:t xml:space="preserve">Level Three — полная подготовка, операционные документы, подача, 2 раунда ответов FCA</w:t>
             </w:r>
           </w:p>
         </w:tc>
@@ -2355,7 +2335,7 @@
                 <w:sz w:val="18"/>
                 <w:szCs w:val="18"/>
               </w:rPr>
-              <w:t xml:space="preserve">£4,200 (12 ч × £350)</w:t>
+              <w:t xml:space="preserve">£38,000–42,000</w:t>
             </w:r>
           </w:p>
         </w:tc>
@@ -2391,7 +2371,7 @@
                 <w:sz w:val="18"/>
                 <w:szCs w:val="18"/>
               </w:rPr>
-              <w:t xml:space="preserve">Level One — только проверка готовых документов</w:t>
+              <w:t xml:space="preserve">Раунды ответов FCA сверх двух</w:t>
             </w:r>
           </w:p>
         </w:tc>
@@ -2418,7 +2398,7 @@
                 <w:sz w:val="18"/>
                 <w:szCs w:val="18"/>
               </w:rPr>
-              <w:t xml:space="preserve">£16,000–20,000</w:t>
+              <w:t xml:space="preserve">£350/ч</w:t>
             </w:r>
           </w:p>
         </w:tc>
@@ -2454,7 +2434,7 @@
                 <w:sz w:val="18"/>
                 <w:szCs w:val="18"/>
               </w:rPr>
-              <w:t xml:space="preserve">Level Two — пишут документы, 1 раунд ответов FCA</w:t>
+              <w:t xml:space="preserve">Собеседование SMF</w:t>
             </w:r>
           </w:p>
         </w:tc>
@@ -2481,7 +2461,7 @@
                 <w:sz w:val="18"/>
                 <w:szCs w:val="18"/>
               </w:rPr>
-              <w:t xml:space="preserve">£25,000–30,000</w:t>
+              <w:t xml:space="preserve">£2,000 за каждое</w:t>
             </w:r>
           </w:p>
         </w:tc>
@@ -2517,7 +2497,7 @@
                 <w:sz w:val="18"/>
                 <w:szCs w:val="18"/>
               </w:rPr>
-              <w:t xml:space="preserve">Level Three — всё + операционные документы, 2 раунда</w:t>
+              <w:t xml:space="preserve">Реалистичный итог (2–3 собеседования, возможно 1 доп. раунд)</w:t>
             </w:r>
           </w:p>
         </w:tc>
@@ -2544,70 +2524,7 @@
                 <w:sz w:val="18"/>
                 <w:szCs w:val="18"/>
               </w:rPr>
-              <w:t xml:space="preserve">£38,000–42,000</w:t>
-            </w:r>
-          </w:p>
-        </w:tc>
-      </w:tr>
-      <w:tr>
-        <w:trPr>
-          <w:cantSplit/>
-          <w:tblHeader w:val="off"/>
-        </w:trPr>
-        <w:tc>
-          <w:tcPr>
-            <w:tcW w:type="dxa" w:w="4680"/>
-            <w:tcBorders>
-              <w:top w:val="single" w:color="BFBFBF" w:sz="4"/>
-              <w:left w:val="single" w:color="BFBFBF" w:sz="4"/>
-              <w:bottom w:val="single" w:color="BFBFBF" w:sz="4"/>
-              <w:right w:val="single" w:color="BFBFBF" w:sz="4"/>
-            </w:tcBorders>
-            <w:shd w:fill="EEF2F8" w:color="auto" w:val="clear"/>
-            <w:tcMar>
-              <w:top w:type="dxa" w:w="60"/>
-              <w:left w:type="dxa" w:w="100"/>
-              <w:bottom w:type="dxa" w:w="60"/>
-              <w:right w:type="dxa" w:w="100"/>
-            </w:tcMar>
-          </w:tcPr>
-          <w:p>
-            <w:r>
-              <w:rPr>
-                <w:rFonts w:ascii="Arial" w:cs="Arial" w:eastAsia="Arial" w:hAnsi="Arial"/>
-                <w:b/>
-                <w:bCs/>
-                <w:sz w:val="18"/>
-                <w:szCs w:val="18"/>
-              </w:rPr>
-              <w:t xml:space="preserve">Собеседование SMF (любой уровень)</w:t>
-            </w:r>
-          </w:p>
-        </w:tc>
-        <w:tc>
-          <w:tcPr>
-            <w:tcW w:type="dxa" w:w="4680"/>
-            <w:tcBorders>
-              <w:top w:val="single" w:color="BFBFBF" w:sz="4"/>
-              <w:left w:val="single" w:color="BFBFBF" w:sz="4"/>
-              <w:bottom w:val="single" w:color="BFBFBF" w:sz="4"/>
-              <w:right w:val="single" w:color="BFBFBF" w:sz="4"/>
-            </w:tcBorders>
-            <w:tcMar>
-              <w:top w:type="dxa" w:w="60"/>
-              <w:left w:type="dxa" w:w="100"/>
-              <w:bottom w:type="dxa" w:w="60"/>
-              <w:right w:type="dxa" w:w="100"/>
-            </w:tcMar>
-          </w:tcPr>
-          <w:p>
-            <w:r>
-              <w:rPr>
-                <w:rFonts w:ascii="Arial" w:cs="Arial" w:eastAsia="Arial" w:hAnsi="Arial"/>
-                <w:sz w:val="18"/>
-                <w:szCs w:val="18"/>
-              </w:rPr>
-              <w:t xml:space="preserve">£2,000 за каждое</w:t>
+              <w:t xml:space="preserve">≈ £50–56k</w:t>
             </w:r>
           </w:p>
         </w:tc>
@@ -2754,25 +2671,25 @@
           <w:sz w:val="20"/>
           <w:szCs w:val="20"/>
         </w:rPr>
-        <w:t xml:space="preserve">Level One нам не подходит: они только проверяют готовые документы, а у Hypergate документов нет.</w:t>
-      </w:r>
-    </w:p>
-    <w:p>
-      <w:pPr>
-        <w:pStyle w:val="ListParagraph"/>
-        <w:numPr>
-          <w:ilvl w:val="0"/>
-          <w:numId w:val="2"/>
-        </w:numPr>
-        <w:spacing w:after="50"/>
-      </w:pPr>
-      <w:r>
-        <w:rPr>
-          <w:rFonts w:ascii="Arial" w:cs="Arial" w:eastAsia="Arial" w:hAnsi="Arial"/>
-          <w:sz w:val="20"/>
-          <w:szCs w:val="20"/>
-        </w:rPr>
-        <w:t xml:space="preserve">Level Two включает только 1 раунд ответов FCA (до 10 ч). FCA по новому режиму, вероятно, будет задавать 2–3 раунда, каждый следующий — по £350/ч.</w:t>
+        <w:t xml:space="preserve">Рассматриваем только Level Three: Level One — лишь проверка готовых документов, Level Two — 1 раунд ответов FCA, обоих недостаточно.</w:t>
+      </w:r>
+    </w:p>
+    <w:p>
+      <w:pPr>
+        <w:pStyle w:val="ListParagraph"/>
+        <w:numPr>
+          <w:ilvl w:val="0"/>
+          <w:numId w:val="2"/>
+        </w:numPr>
+        <w:spacing w:after="50"/>
+      </w:pPr>
+      <w:r>
+        <w:rPr>
+          <w:rFonts w:ascii="Arial" w:cs="Arial" w:eastAsia="Arial" w:hAnsi="Arial"/>
+          <w:sz w:val="20"/>
+          <w:szCs w:val="20"/>
+        </w:rPr>
+        <w:t xml:space="preserve">В Level Three 2 раунда ответов FCA по 10 ч. Если FCA задаст 3-й раунд (вероятно по новому режиму), он оплачивается по £350/ч.</w:t>
       </w:r>
     </w:p>
     <w:p>
@@ -2893,7 +2810,7 @@
           <w:sz w:val="20"/>
           <w:szCs w:val="20"/>
         </w:rPr>
-        <w:t xml:space="preserve">Бюджетный вариант. Имеет смысл только Level Three (≈ £42k + PERG + собеседования ≈ £50–55k) или Level Two с договорённостью о 2 раундах ответов FCA. Перед выбором нужен формальный Proposal с фиксированной ценой.</w:t>
+        <w:t xml:space="preserve">Бюджетный вариант: Level Three ≈ £50–56k с PERG и собеседованиями — дешевле ComplyCraft и Fintheo на £25–40k, но с лимитом на ответы FCA. Перед выбором нужен формальный Proposal с фиксированной ценой.</w:t>
       </w:r>
     </w:p>
     <w:p>
@@ -4757,7 +4674,25 @@
           <w:sz w:val="20"/>
           <w:szCs w:val="20"/>
         </w:rPr>
-        <w:t xml:space="preserve">Пришлите формальный Proposal с фиксированной ценой на Level Three или на Level Two с 2 раундами ответов FCA.</w:t>
+        <w:t xml:space="preserve">Пришлите формальный Proposal на Level Three с фиксированной ценой, включая PERG.</w:t>
+      </w:r>
+    </w:p>
+    <w:p>
+      <w:pPr>
+        <w:pStyle w:val="ListParagraph"/>
+        <w:numPr>
+          <w:ilvl w:val="0"/>
+          <w:numId w:val="2"/>
+        </w:numPr>
+        <w:spacing w:after="50"/>
+      </w:pPr>
+      <w:r>
+        <w:rPr>
+          <w:rFonts w:ascii="Arial" w:cs="Arial" w:eastAsia="Arial" w:hAnsi="Arial"/>
+          <w:sz w:val="20"/>
+          <w:szCs w:val="20"/>
+        </w:rPr>
+        <w:t xml:space="preserve">Можно ли включить 3-й раунд ответов FCA и ответ на «minded to refuse» в цену Level Three?</w:t>
       </w:r>
     </w:p>
     <w:p>

</xml_diff>

<commit_message>
Offers comparison: add crypto track-record verification for all three firms
Co-Authored-By: Claude Opus 5.5 <noreply@anthropic.com>
Claude-Session: https://claude.ai/code/session_01B5RNGs6XtNXKFMQvGGhdBf
</commit_message>
<xml_diff>
--- a/hypergate/Hypergate_FCA_offers_comparison.docx
+++ b/hypergate/Hypergate_FCA_offers_comparison.docx
@@ -103,7 +103,7 @@
           <w:sz w:val="20"/>
           <w:szCs w:val="20"/>
         </w:rPr>
-        <w:t xml:space="preserve">(£80k: £60k до подачи + £20k после). Вели заявку Archax, работают с Galaxy Digital. Но цена названа «фиксированной», а оплата — по фактически затраченному времени, это нужно уточнить.</w:t>
+        <w:t xml:space="preserve">(£80k: £60k до подачи + £20k после). По их словам, вели заявку Archax и работают с Galaxy Digital, но независимо это не подтверждается (см. раздел 8). Цена названа «фиксированной», а оплата — по фактически затраченному времени, это нужно уточнить.</w:t>
       </w:r>
     </w:p>
     <w:p>
@@ -1753,7 +1753,7 @@
                 <w:sz w:val="18"/>
                 <w:szCs w:val="18"/>
               </w:rPr>
-              <w:t xml:space="preserve">Крупная фирма (200–260 чел.), своя ComplyCrypto; конкретных крипто-кейсов в оффере нет</w:t>
+              <w:t xml:space="preserve">Только свои компании: ComplyCrypto UK (регистрация MLR) и EU (MiCA). Внешних крипто-клиентов не найдено</w:t>
             </w:r>
           </w:p>
         </w:tc>
@@ -1780,7 +1780,7 @@
                 <w:sz w:val="18"/>
                 <w:szCs w:val="18"/>
               </w:rPr>
-              <w:t xml:space="preserve">Archax (MTF), Galaxy Digital; ещё 2 заявки по новому крипто-режиму сейчас</w:t>
+              <w:t xml:space="preserve">Заявляют Archax и Galaxy Digital — независимо не подтверждено; Archax получила лицензию в 2020, до основания ComplyCraft (2021)</w:t>
             </w:r>
           </w:p>
         </w:tc>
@@ -1807,7 +1807,7 @@
                 <w:sz w:val="18"/>
                 <w:szCs w:val="18"/>
               </w:rPr>
-              <w:t xml:space="preserve">41 лицензия, 0 отказов (в основном платёжные компании, EMI, ЕС); конкретных крипто-кейсов нет</w:t>
+              <w:t xml:space="preserve">Подтверждён 1 кейс — EMI-лицензия Payler. Крипто-кейсов не найдено; группа зарегистрирована в 2024</w:t>
             </w:r>
           </w:p>
         </w:tc>
@@ -3069,7 +3069,7 @@
           <w:sz w:val="20"/>
           <w:szCs w:val="20"/>
         </w:rPr>
-        <w:t xml:space="preserve">Самый релевантный опыт: заявка Archax (крипто-MTF), поддержка Galaxy Digital в UK и Гонконге, ещё 2 заявки по новому крипто-режиму в работе.</w:t>
+        <w:t xml:space="preserve">Самый релевантный заявленный опыт: заявка Archax, поддержка Galaxy Digital в UK и Гонконге, ещё 2 заявки по новому крипто-режиму в работе. Независимо не подтверждено — см. раздел 8.</w:t>
       </w:r>
     </w:p>
     <w:p>
@@ -4063,7 +4063,7 @@
           <w:sz w:val="20"/>
           <w:szCs w:val="20"/>
         </w:rPr>
-        <w:t xml:space="preserve">Опыт: 6+ лет, 41 лицензия, но в основном платёжные компании и EMI в UK/ЕС. Конкретных кейсов по крипто-трейдингу в оффере нет.</w:t>
+        <w:t xml:space="preserve">Опыт: заявляют 6+ лет и 41 лицензию, но в основном это платёжные компании и EMI в UK/ЕС. Крипто-кейсов нет ни в оффере, ни в открытых источниках (см. раздел 8).</w:t>
       </w:r>
     </w:p>
     <w:p>
@@ -4891,6 +4891,1351 @@
           <w:szCs w:val="20"/>
         </w:rPr>
         <w:t xml:space="preserve">Сколько стоит параллельная MLR-регистрация?</w:t>
+      </w:r>
+    </w:p>
+    <w:p>
+      <w:r>
+        <w:br w:type="page"/>
+      </w:r>
+    </w:p>
+    <w:p>
+      <w:pPr>
+        <w:pStyle w:val="Heading1"/>
+        <w:keepNext/>
+        <w:spacing w:after="140" w:before="320"/>
+      </w:pPr>
+      <w:r>
+        <w:rPr>
+          <w:rFonts w:ascii="Arial" w:cs="Arial" w:eastAsia="Arial" w:hAnsi="Arial"/>
+          <w:b/>
+          <w:bCs/>
+          <w:color w:val="1F3864"/>
+          <w:sz w:val="30"/>
+          <w:szCs w:val="30"/>
+        </w:rPr>
+        <w:t xml:space="preserve">8. Проверка: профессиональные достижения и опыт в крипте</w:t>
+      </w:r>
+    </w:p>
+    <w:p>
+      <w:pPr>
+        <w:spacing w:after="100"/>
+      </w:pPr>
+      <w:r>
+        <w:rPr>
+          <w:rFonts w:ascii="Arial" w:cs="Arial" w:eastAsia="Arial" w:hAnsi="Arial"/>
+          <w:i/>
+          <w:iCs/>
+          <w:color w:val="595959"/>
+          <w:sz w:val="18"/>
+          <w:szCs w:val="18"/>
+        </w:rPr>
+        <w:t xml:space="preserve">Только то, что удалось найти в открытых источниках (19.10.2026). «Заявлено» — со слов самой фирмы; «подтверждено» — есть в независимых источниках или реестрах.</w:t>
+      </w:r>
+    </w:p>
+    <w:p>
+      <w:pPr>
+        <w:pStyle w:val="Heading2"/>
+        <w:keepNext/>
+        <w:spacing w:after="80" w:before="200"/>
+      </w:pPr>
+      <w:r>
+        <w:rPr>
+          <w:rFonts w:ascii="Arial" w:cs="Arial" w:eastAsia="Arial" w:hAnsi="Arial"/>
+          <w:b/>
+          <w:bCs/>
+          <w:color w:val="2F5496"/>
+          <w:sz w:val="22"/>
+          <w:szCs w:val="22"/>
+        </w:rPr>
+        <w:t xml:space="preserve">Complyport</w:t>
+      </w:r>
+    </w:p>
+    <w:tbl>
+      <w:tblPr>
+        <w:tblW w:type="dxa" w:w="9360"/>
+        <w:tblBorders>
+          <w:top w:val="single" w:color="auto" w:sz="4"/>
+          <w:left w:val="single" w:color="auto" w:sz="4"/>
+          <w:bottom w:val="single" w:color="auto" w:sz="4"/>
+          <w:right w:val="single" w:color="auto" w:sz="4"/>
+          <w:insideH w:val="single" w:color="auto" w:sz="4"/>
+          <w:insideV w:val="single" w:color="auto" w:sz="4"/>
+        </w:tblBorders>
+      </w:tblPr>
+      <w:tblGrid>
+        <w:gridCol w:w="2200"/>
+        <w:gridCol w:w="7160"/>
+      </w:tblGrid>
+      <w:tr>
+        <w:trPr>
+          <w:cantSplit/>
+          <w:tblHeader/>
+        </w:trPr>
+        <w:tc>
+          <w:tcPr>
+            <w:tcW w:type="dxa" w:w="2200"/>
+            <w:tcBorders>
+              <w:top w:val="single" w:color="BFBFBF" w:sz="4"/>
+              <w:left w:val="single" w:color="BFBFBF" w:sz="4"/>
+              <w:bottom w:val="single" w:color="BFBFBF" w:sz="4"/>
+              <w:right w:val="single" w:color="BFBFBF" w:sz="4"/>
+            </w:tcBorders>
+            <w:shd w:fill="1F3864" w:color="auto" w:val="clear"/>
+            <w:tcMar>
+              <w:top w:type="dxa" w:w="60"/>
+              <w:left w:type="dxa" w:w="100"/>
+              <w:bottom w:type="dxa" w:w="60"/>
+              <w:right w:type="dxa" w:w="100"/>
+            </w:tcMar>
+          </w:tcPr>
+          <w:p>
+            <w:r>
+              <w:rPr>
+                <w:rFonts w:ascii="Arial" w:cs="Arial" w:eastAsia="Arial" w:hAnsi="Arial"/>
+                <w:b/>
+                <w:bCs/>
+                <w:color w:val="FFFFFF"/>
+                <w:sz w:val="18"/>
+                <w:szCs w:val="18"/>
+              </w:rPr>
+              <w:t xml:space="preserve"/>
+            </w:r>
+          </w:p>
+        </w:tc>
+        <w:tc>
+          <w:tcPr>
+            <w:tcW w:type="dxa" w:w="7160"/>
+            <w:tcBorders>
+              <w:top w:val="single" w:color="BFBFBF" w:sz="4"/>
+              <w:left w:val="single" w:color="BFBFBF" w:sz="4"/>
+              <w:bottom w:val="single" w:color="BFBFBF" w:sz="4"/>
+              <w:right w:val="single" w:color="BFBFBF" w:sz="4"/>
+            </w:tcBorders>
+            <w:shd w:fill="1F3864" w:color="auto" w:val="clear"/>
+            <w:tcMar>
+              <w:top w:type="dxa" w:w="60"/>
+              <w:left w:type="dxa" w:w="100"/>
+              <w:bottom w:type="dxa" w:w="60"/>
+              <w:right w:type="dxa" w:w="100"/>
+            </w:tcMar>
+          </w:tcPr>
+          <w:p>
+            <w:r>
+              <w:rPr>
+                <w:rFonts w:ascii="Arial" w:cs="Arial" w:eastAsia="Arial" w:hAnsi="Arial"/>
+                <w:b/>
+                <w:bCs/>
+                <w:color w:val="FFFFFF"/>
+                <w:sz w:val="18"/>
+                <w:szCs w:val="18"/>
+              </w:rPr>
+              <w:t xml:space="preserve">Что нашли</w:t>
+            </w:r>
+          </w:p>
+        </w:tc>
+      </w:tr>
+      <w:tr>
+        <w:trPr>
+          <w:cantSplit/>
+          <w:tblHeader w:val="off"/>
+        </w:trPr>
+        <w:tc>
+          <w:tcPr>
+            <w:tcW w:type="dxa" w:w="2200"/>
+            <w:tcBorders>
+              <w:top w:val="single" w:color="BFBFBF" w:sz="4"/>
+              <w:left w:val="single" w:color="BFBFBF" w:sz="4"/>
+              <w:bottom w:val="single" w:color="BFBFBF" w:sz="4"/>
+              <w:right w:val="single" w:color="BFBFBF" w:sz="4"/>
+            </w:tcBorders>
+            <w:shd w:fill="EEF2F8" w:color="auto" w:val="clear"/>
+            <w:tcMar>
+              <w:top w:type="dxa" w:w="60"/>
+              <w:left w:type="dxa" w:w="100"/>
+              <w:bottom w:type="dxa" w:w="60"/>
+              <w:right w:type="dxa" w:w="100"/>
+            </w:tcMar>
+          </w:tcPr>
+          <w:p>
+            <w:r>
+              <w:rPr>
+                <w:rFonts w:ascii="Arial" w:cs="Arial" w:eastAsia="Arial" w:hAnsi="Arial"/>
+                <w:b/>
+                <w:bCs/>
+                <w:sz w:val="18"/>
+                <w:szCs w:val="18"/>
+              </w:rPr>
+              <w:t xml:space="preserve">Подтверждено</w:t>
+            </w:r>
+          </w:p>
+        </w:tc>
+        <w:tc>
+          <w:tcPr>
+            <w:tcW w:type="dxa" w:w="7160"/>
+            <w:tcBorders>
+              <w:top w:val="single" w:color="BFBFBF" w:sz="4"/>
+              <w:left w:val="single" w:color="BFBFBF" w:sz="4"/>
+              <w:bottom w:val="single" w:color="BFBFBF" w:sz="4"/>
+              <w:right w:val="single" w:color="BFBFBF" w:sz="4"/>
+            </w:tcBorders>
+            <w:shd w:fill="E2EFDA" w:color="auto" w:val="clear"/>
+            <w:tcMar>
+              <w:top w:type="dxa" w:w="60"/>
+              <w:left w:type="dxa" w:w="100"/>
+              <w:bottom w:type="dxa" w:w="60"/>
+              <w:right w:type="dxa" w:w="100"/>
+            </w:tcMar>
+          </w:tcPr>
+          <w:p>
+            <w:r>
+              <w:rPr>
+                <w:rFonts w:ascii="Arial" w:cs="Arial" w:eastAsia="Arial" w:hAnsi="Arial"/>
+                <w:sz w:val="18"/>
+                <w:szCs w:val="18"/>
+              </w:rPr>
+              <w:t xml:space="preserve">• Входят в консультационную панель FCA/PRA (Skilled Persons Panel) по 8 направлениям — отбирает сам регулятор.</w:t>
+            </w:r>
+          </w:p>
+          <w:p>
+            <w:r>
+              <w:rPr>
+                <w:rFonts w:ascii="Arial" w:cs="Arial" w:eastAsia="Arial" w:hAnsi="Arial"/>
+                <w:sz w:val="18"/>
+                <w:szCs w:val="18"/>
+              </w:rPr>
+              <w:t xml:space="preserve">• ComplyCrypto Depository Ltd (UK, доля Complyport 25–50%): регистрация в FCA по MLR как криптобиржа, сентябрь 2024, FRN 1015150. Заявку вёл авторизационный отдел Complyport, срок — меньше 6 месяцев.</w:t>
+            </w:r>
+          </w:p>
+        </w:tc>
+      </w:tr>
+      <w:tr>
+        <w:trPr>
+          <w:cantSplit/>
+          <w:tblHeader w:val="off"/>
+        </w:trPr>
+        <w:tc>
+          <w:tcPr>
+            <w:tcW w:type="dxa" w:w="2200"/>
+            <w:tcBorders>
+              <w:top w:val="single" w:color="BFBFBF" w:sz="4"/>
+              <w:left w:val="single" w:color="BFBFBF" w:sz="4"/>
+              <w:bottom w:val="single" w:color="BFBFBF" w:sz="4"/>
+              <w:right w:val="single" w:color="BFBFBF" w:sz="4"/>
+            </w:tcBorders>
+            <w:shd w:fill="EEF2F8" w:color="auto" w:val="clear"/>
+            <w:tcMar>
+              <w:top w:type="dxa" w:w="60"/>
+              <w:left w:type="dxa" w:w="100"/>
+              <w:bottom w:type="dxa" w:w="60"/>
+              <w:right w:type="dxa" w:w="100"/>
+            </w:tcMar>
+          </w:tcPr>
+          <w:p>
+            <w:r>
+              <w:rPr>
+                <w:rFonts w:ascii="Arial" w:cs="Arial" w:eastAsia="Arial" w:hAnsi="Arial"/>
+                <w:b/>
+                <w:bCs/>
+                <w:sz w:val="18"/>
+                <w:szCs w:val="18"/>
+              </w:rPr>
+              <w:t xml:space="preserve">Заявлено</w:t>
+            </w:r>
+          </w:p>
+        </w:tc>
+        <w:tc>
+          <w:tcPr>
+            <w:tcW w:type="dxa" w:w="7160"/>
+            <w:tcBorders>
+              <w:top w:val="single" w:color="BFBFBF" w:sz="4"/>
+              <w:left w:val="single" w:color="BFBFBF" w:sz="4"/>
+              <w:bottom w:val="single" w:color="BFBFBF" w:sz="4"/>
+              <w:right w:val="single" w:color="BFBFBF" w:sz="4"/>
+            </w:tcBorders>
+            <w:shd w:fill="FFF2CC" w:color="auto" w:val="clear"/>
+            <w:tcMar>
+              <w:top w:type="dxa" w:w="60"/>
+              <w:left w:type="dxa" w:w="100"/>
+              <w:bottom w:type="dxa" w:w="60"/>
+              <w:right w:type="dxa" w:w="100"/>
+            </w:tcMar>
+          </w:tcPr>
+          <w:p>
+            <w:r>
+              <w:rPr>
+                <w:rFonts w:ascii="Arial" w:cs="Arial" w:eastAsia="Arial" w:hAnsi="Arial"/>
+                <w:sz w:val="18"/>
+                <w:szCs w:val="18"/>
+              </w:rPr>
+              <w:t xml:space="preserve">• 1,000–1,500 авторизаций в UK, ЕС и ОАЭ.</w:t>
+            </w:r>
+          </w:p>
+          <w:p>
+            <w:r>
+              <w:rPr>
+                <w:rFonts w:ascii="Arial" w:cs="Arial" w:eastAsia="Arial" w:hAnsi="Arial"/>
+                <w:sz w:val="18"/>
+                <w:szCs w:val="18"/>
+              </w:rPr>
+              <w:t xml:space="preserve">• ComplyCrypto Depository EU Ltd (Кипр) — лицензия MiCA (CASP) от CySEC, 29.06.2026 (по реестрам-агрегаторам; первичный реестр не проверен).</w:t>
+            </w:r>
+          </w:p>
+          <w:p>
+            <w:r>
+              <w:rPr>
+                <w:rFonts w:ascii="Arial" w:cs="Arial" w:eastAsia="Arial" w:hAnsi="Arial"/>
+                <w:sz w:val="18"/>
+                <w:szCs w:val="18"/>
+              </w:rPr>
+              <w:t xml:space="preserve">• Премии «Regulatory &amp; Compliance Consultancy of the Year» 2023 и 2025 — коммерческие, веса мало.</w:t>
+            </w:r>
+          </w:p>
+        </w:tc>
+      </w:tr>
+      <w:tr>
+        <w:trPr>
+          <w:cantSplit/>
+          <w:tblHeader w:val="off"/>
+        </w:trPr>
+        <w:tc>
+          <w:tcPr>
+            <w:tcW w:type="dxa" w:w="2200"/>
+            <w:tcBorders>
+              <w:top w:val="single" w:color="BFBFBF" w:sz="4"/>
+              <w:left w:val="single" w:color="BFBFBF" w:sz="4"/>
+              <w:bottom w:val="single" w:color="BFBFBF" w:sz="4"/>
+              <w:right w:val="single" w:color="BFBFBF" w:sz="4"/>
+            </w:tcBorders>
+            <w:shd w:fill="EEF2F8" w:color="auto" w:val="clear"/>
+            <w:tcMar>
+              <w:top w:type="dxa" w:w="60"/>
+              <w:left w:type="dxa" w:w="100"/>
+              <w:bottom w:type="dxa" w:w="60"/>
+              <w:right w:type="dxa" w:w="100"/>
+            </w:tcMar>
+          </w:tcPr>
+          <w:p>
+            <w:r>
+              <w:rPr>
+                <w:rFonts w:ascii="Arial" w:cs="Arial" w:eastAsia="Arial" w:hAnsi="Arial"/>
+                <w:b/>
+                <w:bCs/>
+                <w:sz w:val="18"/>
+                <w:szCs w:val="18"/>
+              </w:rPr>
+              <w:t xml:space="preserve">Не найдено</w:t>
+            </w:r>
+          </w:p>
+        </w:tc>
+        <w:tc>
+          <w:tcPr>
+            <w:tcW w:type="dxa" w:w="7160"/>
+            <w:tcBorders>
+              <w:top w:val="single" w:color="BFBFBF" w:sz="4"/>
+              <w:left w:val="single" w:color="BFBFBF" w:sz="4"/>
+              <w:bottom w:val="single" w:color="BFBFBF" w:sz="4"/>
+              <w:right w:val="single" w:color="BFBFBF" w:sz="4"/>
+            </w:tcBorders>
+            <w:shd w:fill="FCE4D6" w:color="auto" w:val="clear"/>
+            <w:tcMar>
+              <w:top w:type="dxa" w:w="60"/>
+              <w:left w:type="dxa" w:w="100"/>
+              <w:bottom w:type="dxa" w:w="60"/>
+              <w:right w:type="dxa" w:w="100"/>
+            </w:tcMar>
+          </w:tcPr>
+          <w:p>
+            <w:r>
+              <w:rPr>
+                <w:rFonts w:ascii="Arial" w:cs="Arial" w:eastAsia="Arial" w:hAnsi="Arial"/>
+                <w:sz w:val="18"/>
+                <w:szCs w:val="18"/>
+              </w:rPr>
+              <w:t xml:space="preserve">• Ни одного внешнего крипто-клиента, проведённого через FCA (ни MLR, ни новый режим).</w:t>
+            </w:r>
+          </w:p>
+          <w:p>
+            <w:r>
+              <w:rPr>
+                <w:rFonts w:ascii="Arial" w:cs="Arial" w:eastAsia="Arial" w:hAnsi="Arial"/>
+                <w:sz w:val="18"/>
+                <w:szCs w:val="18"/>
+              </w:rPr>
+              <w:t xml:space="preserve">• Опубликованных крипто-кейсов и отзывов клиентов.</w:t>
+            </w:r>
+          </w:p>
+        </w:tc>
+      </w:tr>
+      <w:tr>
+        <w:trPr>
+          <w:cantSplit/>
+          <w:tblHeader w:val="off"/>
+        </w:trPr>
+        <w:tc>
+          <w:tcPr>
+            <w:tcW w:type="dxa" w:w="2200"/>
+            <w:tcBorders>
+              <w:top w:val="single" w:color="BFBFBF" w:sz="4"/>
+              <w:left w:val="single" w:color="BFBFBF" w:sz="4"/>
+              <w:bottom w:val="single" w:color="BFBFBF" w:sz="4"/>
+              <w:right w:val="single" w:color="BFBFBF" w:sz="4"/>
+            </w:tcBorders>
+            <w:shd w:fill="EEF2F8" w:color="auto" w:val="clear"/>
+            <w:tcMar>
+              <w:top w:type="dxa" w:w="60"/>
+              <w:left w:type="dxa" w:w="100"/>
+              <w:bottom w:type="dxa" w:w="60"/>
+              <w:right w:type="dxa" w:w="100"/>
+            </w:tcMar>
+          </w:tcPr>
+          <w:p>
+            <w:r>
+              <w:rPr>
+                <w:rFonts w:ascii="Arial" w:cs="Arial" w:eastAsia="Arial" w:hAnsi="Arial"/>
+                <w:b/>
+                <w:bCs/>
+                <w:sz w:val="18"/>
+                <w:szCs w:val="18"/>
+              </w:rPr>
+              <w:t xml:space="preserve">Вывод</w:t>
+            </w:r>
+          </w:p>
+        </w:tc>
+        <w:tc>
+          <w:tcPr>
+            <w:tcW w:type="dxa" w:w="7160"/>
+            <w:tcBorders>
+              <w:top w:val="single" w:color="BFBFBF" w:sz="4"/>
+              <w:left w:val="single" w:color="BFBFBF" w:sz="4"/>
+              <w:bottom w:val="single" w:color="BFBFBF" w:sz="4"/>
+              <w:right w:val="single" w:color="BFBFBF" w:sz="4"/>
+            </w:tcBorders>
+            <w:tcMar>
+              <w:top w:type="dxa" w:w="60"/>
+              <w:left w:type="dxa" w:w="100"/>
+              <w:bottom w:type="dxa" w:w="60"/>
+              <w:right w:type="dxa" w:w="100"/>
+            </w:tcMar>
+          </w:tcPr>
+          <w:p>
+            <w:r>
+              <w:rPr>
+                <w:rFonts w:ascii="Arial" w:cs="Arial" w:eastAsia="Arial" w:hAnsi="Arial"/>
+                <w:sz w:val="18"/>
+                <w:szCs w:val="18"/>
+              </w:rPr>
+              <w:t xml:space="preserve">Сильные позиции у регулятора, но крипто-опыт — только заявки собственных компаний группы. Остальное крипто-направление — расследования и изъятие активов.</w:t>
+            </w:r>
+          </w:p>
+        </w:tc>
+      </w:tr>
+    </w:tbl>
+    <w:p>
+      <w:pPr>
+        <w:pStyle w:val="Heading2"/>
+        <w:keepNext/>
+        <w:spacing w:after="80" w:before="200"/>
+      </w:pPr>
+      <w:r>
+        <w:rPr>
+          <w:rFonts w:ascii="Arial" w:cs="Arial" w:eastAsia="Arial" w:hAnsi="Arial"/>
+          <w:b/>
+          <w:bCs/>
+          <w:color w:val="2F5496"/>
+          <w:sz w:val="22"/>
+          <w:szCs w:val="22"/>
+        </w:rPr>
+        <w:t xml:space="preserve">ComplyCraft Consulting</w:t>
+      </w:r>
+    </w:p>
+    <w:tbl>
+      <w:tblPr>
+        <w:tblW w:type="dxa" w:w="9360"/>
+        <w:tblBorders>
+          <w:top w:val="single" w:color="auto" w:sz="4"/>
+          <w:left w:val="single" w:color="auto" w:sz="4"/>
+          <w:bottom w:val="single" w:color="auto" w:sz="4"/>
+          <w:right w:val="single" w:color="auto" w:sz="4"/>
+          <w:insideH w:val="single" w:color="auto" w:sz="4"/>
+          <w:insideV w:val="single" w:color="auto" w:sz="4"/>
+        </w:tblBorders>
+      </w:tblPr>
+      <w:tblGrid>
+        <w:gridCol w:w="2200"/>
+        <w:gridCol w:w="7160"/>
+      </w:tblGrid>
+      <w:tr>
+        <w:trPr>
+          <w:cantSplit/>
+          <w:tblHeader/>
+        </w:trPr>
+        <w:tc>
+          <w:tcPr>
+            <w:tcW w:type="dxa" w:w="2200"/>
+            <w:tcBorders>
+              <w:top w:val="single" w:color="BFBFBF" w:sz="4"/>
+              <w:left w:val="single" w:color="BFBFBF" w:sz="4"/>
+              <w:bottom w:val="single" w:color="BFBFBF" w:sz="4"/>
+              <w:right w:val="single" w:color="BFBFBF" w:sz="4"/>
+            </w:tcBorders>
+            <w:shd w:fill="1F3864" w:color="auto" w:val="clear"/>
+            <w:tcMar>
+              <w:top w:type="dxa" w:w="60"/>
+              <w:left w:type="dxa" w:w="100"/>
+              <w:bottom w:type="dxa" w:w="60"/>
+              <w:right w:type="dxa" w:w="100"/>
+            </w:tcMar>
+          </w:tcPr>
+          <w:p>
+            <w:r>
+              <w:rPr>
+                <w:rFonts w:ascii="Arial" w:cs="Arial" w:eastAsia="Arial" w:hAnsi="Arial"/>
+                <w:b/>
+                <w:bCs/>
+                <w:color w:val="FFFFFF"/>
+                <w:sz w:val="18"/>
+                <w:szCs w:val="18"/>
+              </w:rPr>
+              <w:t xml:space="preserve"/>
+            </w:r>
+          </w:p>
+        </w:tc>
+        <w:tc>
+          <w:tcPr>
+            <w:tcW w:type="dxa" w:w="7160"/>
+            <w:tcBorders>
+              <w:top w:val="single" w:color="BFBFBF" w:sz="4"/>
+              <w:left w:val="single" w:color="BFBFBF" w:sz="4"/>
+              <w:bottom w:val="single" w:color="BFBFBF" w:sz="4"/>
+              <w:right w:val="single" w:color="BFBFBF" w:sz="4"/>
+            </w:tcBorders>
+            <w:shd w:fill="1F3864" w:color="auto" w:val="clear"/>
+            <w:tcMar>
+              <w:top w:type="dxa" w:w="60"/>
+              <w:left w:type="dxa" w:w="100"/>
+              <w:bottom w:type="dxa" w:w="60"/>
+              <w:right w:type="dxa" w:w="100"/>
+            </w:tcMar>
+          </w:tcPr>
+          <w:p>
+            <w:r>
+              <w:rPr>
+                <w:rFonts w:ascii="Arial" w:cs="Arial" w:eastAsia="Arial" w:hAnsi="Arial"/>
+                <w:b/>
+                <w:bCs/>
+                <w:color w:val="FFFFFF"/>
+                <w:sz w:val="18"/>
+                <w:szCs w:val="18"/>
+              </w:rPr>
+              <w:t xml:space="preserve">Что нашли</w:t>
+            </w:r>
+          </w:p>
+        </w:tc>
+      </w:tr>
+      <w:tr>
+        <w:trPr>
+          <w:cantSplit/>
+          <w:tblHeader w:val="off"/>
+        </w:trPr>
+        <w:tc>
+          <w:tcPr>
+            <w:tcW w:type="dxa" w:w="2200"/>
+            <w:tcBorders>
+              <w:top w:val="single" w:color="BFBFBF" w:sz="4"/>
+              <w:left w:val="single" w:color="BFBFBF" w:sz="4"/>
+              <w:bottom w:val="single" w:color="BFBFBF" w:sz="4"/>
+              <w:right w:val="single" w:color="BFBFBF" w:sz="4"/>
+            </w:tcBorders>
+            <w:shd w:fill="EEF2F8" w:color="auto" w:val="clear"/>
+            <w:tcMar>
+              <w:top w:type="dxa" w:w="60"/>
+              <w:left w:type="dxa" w:w="100"/>
+              <w:bottom w:type="dxa" w:w="60"/>
+              <w:right w:type="dxa" w:w="100"/>
+            </w:tcMar>
+          </w:tcPr>
+          <w:p>
+            <w:r>
+              <w:rPr>
+                <w:rFonts w:ascii="Arial" w:cs="Arial" w:eastAsia="Arial" w:hAnsi="Arial"/>
+                <w:b/>
+                <w:bCs/>
+                <w:sz w:val="18"/>
+                <w:szCs w:val="18"/>
+              </w:rPr>
+              <w:t xml:space="preserve">Подтверждено</w:t>
+            </w:r>
+          </w:p>
+        </w:tc>
+        <w:tc>
+          <w:tcPr>
+            <w:tcW w:type="dxa" w:w="7160"/>
+            <w:tcBorders>
+              <w:top w:val="single" w:color="BFBFBF" w:sz="4"/>
+              <w:left w:val="single" w:color="BFBFBF" w:sz="4"/>
+              <w:bottom w:val="single" w:color="BFBFBF" w:sz="4"/>
+              <w:right w:val="single" w:color="BFBFBF" w:sz="4"/>
+            </w:tcBorders>
+            <w:shd w:fill="E2EFDA" w:color="auto" w:val="clear"/>
+            <w:tcMar>
+              <w:top w:type="dxa" w:w="60"/>
+              <w:left w:type="dxa" w:w="100"/>
+              <w:bottom w:type="dxa" w:w="60"/>
+              <w:right w:type="dxa" w:w="100"/>
+            </w:tcMar>
+          </w:tcPr>
+          <w:p>
+            <w:r>
+              <w:rPr>
+                <w:rFonts w:ascii="Arial" w:cs="Arial" w:eastAsia="Arial" w:hAnsi="Arial"/>
+                <w:sz w:val="18"/>
+                <w:szCs w:val="18"/>
+              </w:rPr>
+              <w:t xml:space="preserve">• Компания зарегистрирована 4 июня 2021 (Companies House 13440030), Лондон.</w:t>
+            </w:r>
+          </w:p>
+          <w:p>
+            <w:r>
+              <w:rPr>
+                <w:rFonts w:ascii="Arial" w:cs="Arial" w:eastAsia="Arial" w:hAnsi="Arial"/>
+                <w:sz w:val="18"/>
+                <w:szCs w:val="18"/>
+              </w:rPr>
+              <w:t xml:space="preserve">• Отраслевая специализация на сайте: брокеры, торговые площадки, биржи цифровых активов.</w:t>
+            </w:r>
+          </w:p>
+          <w:p>
+            <w:r>
+              <w:rPr>
+                <w:rFonts w:ascii="Arial" w:cs="Arial" w:eastAsia="Arial" w:hAnsi="Arial"/>
+                <w:sz w:val="18"/>
+                <w:szCs w:val="18"/>
+              </w:rPr>
+              <w:t xml:space="preserve">• Активно публикуют аналитику по новому крипто-режиму FCA и MiCA.</w:t>
+            </w:r>
+          </w:p>
+        </w:tc>
+      </w:tr>
+      <w:tr>
+        <w:trPr>
+          <w:cantSplit/>
+          <w:tblHeader w:val="off"/>
+        </w:trPr>
+        <w:tc>
+          <w:tcPr>
+            <w:tcW w:type="dxa" w:w="2200"/>
+            <w:tcBorders>
+              <w:top w:val="single" w:color="BFBFBF" w:sz="4"/>
+              <w:left w:val="single" w:color="BFBFBF" w:sz="4"/>
+              <w:bottom w:val="single" w:color="BFBFBF" w:sz="4"/>
+              <w:right w:val="single" w:color="BFBFBF" w:sz="4"/>
+            </w:tcBorders>
+            <w:shd w:fill="EEF2F8" w:color="auto" w:val="clear"/>
+            <w:tcMar>
+              <w:top w:type="dxa" w:w="60"/>
+              <w:left w:type="dxa" w:w="100"/>
+              <w:bottom w:type="dxa" w:w="60"/>
+              <w:right w:type="dxa" w:w="100"/>
+            </w:tcMar>
+          </w:tcPr>
+          <w:p>
+            <w:r>
+              <w:rPr>
+                <w:rFonts w:ascii="Arial" w:cs="Arial" w:eastAsia="Arial" w:hAnsi="Arial"/>
+                <w:b/>
+                <w:bCs/>
+                <w:sz w:val="18"/>
+                <w:szCs w:val="18"/>
+              </w:rPr>
+              <w:t xml:space="preserve">Заявлено</w:t>
+            </w:r>
+          </w:p>
+        </w:tc>
+        <w:tc>
+          <w:tcPr>
+            <w:tcW w:type="dxa" w:w="7160"/>
+            <w:tcBorders>
+              <w:top w:val="single" w:color="BFBFBF" w:sz="4"/>
+              <w:left w:val="single" w:color="BFBFBF" w:sz="4"/>
+              <w:bottom w:val="single" w:color="BFBFBF" w:sz="4"/>
+              <w:right w:val="single" w:color="BFBFBF" w:sz="4"/>
+            </w:tcBorders>
+            <w:shd w:fill="FFF2CC" w:color="auto" w:val="clear"/>
+            <w:tcMar>
+              <w:top w:type="dxa" w:w="60"/>
+              <w:left w:type="dxa" w:w="100"/>
+              <w:bottom w:type="dxa" w:w="60"/>
+              <w:right w:type="dxa" w:w="100"/>
+            </w:tcMar>
+          </w:tcPr>
+          <w:p>
+            <w:r>
+              <w:rPr>
+                <w:rFonts w:ascii="Arial" w:cs="Arial" w:eastAsia="Arial" w:hAnsi="Arial"/>
+                <w:sz w:val="18"/>
+                <w:szCs w:val="18"/>
+              </w:rPr>
+              <w:t xml:space="preserve">• «Вели успешную MTF-заявку Archax». Но Archax получила лицензию FCA (MTF, хранение, брокеридж) в августе–сентябре 2020 — до основания ComplyCraft. Значит, это опыт сотрудников на прежнем месте работы, а не фирмы. Кроме того, в нашем первом списке Archax значилась клиентом Thistle Consulting.</w:t>
+            </w:r>
+          </w:p>
+          <w:p>
+            <w:r>
+              <w:rPr>
+                <w:rFonts w:ascii="Arial" w:cs="Arial" w:eastAsia="Arial" w:hAnsi="Arial"/>
+                <w:sz w:val="18"/>
+                <w:szCs w:val="18"/>
+              </w:rPr>
+              <w:t xml:space="preserve">• Комплаенс-поддержка Galaxy Digital (UK и Гонконг) — в открытых источниках не найдено.</w:t>
+            </w:r>
+          </w:p>
+          <w:p>
+            <w:r>
+              <w:rPr>
+                <w:rFonts w:ascii="Arial" w:cs="Arial" w:eastAsia="Arial" w:hAnsi="Arial"/>
+                <w:sz w:val="18"/>
+                <w:szCs w:val="18"/>
+              </w:rPr>
+              <w:t xml:space="preserve">• 2 текущие заявки по новому крипто-режиму — клиенты не названы.</w:t>
+            </w:r>
+          </w:p>
+          <w:p>
+            <w:r>
+              <w:rPr>
+                <w:rFonts w:ascii="Arial" w:cs="Arial" w:eastAsia="Arial" w:hAnsi="Arial"/>
+                <w:sz w:val="18"/>
+                <w:szCs w:val="18"/>
+              </w:rPr>
+              <w:t xml:space="preserve">• Damon Batten: 15 лет в рынках капитала, работа с криптобиржами и брокерами в UK, ЕС и APAC. По открытым данным базируется в Гонконге.</w:t>
+            </w:r>
+          </w:p>
+        </w:tc>
+      </w:tr>
+      <w:tr>
+        <w:trPr>
+          <w:cantSplit/>
+          <w:tblHeader w:val="off"/>
+        </w:trPr>
+        <w:tc>
+          <w:tcPr>
+            <w:tcW w:type="dxa" w:w="2200"/>
+            <w:tcBorders>
+              <w:top w:val="single" w:color="BFBFBF" w:sz="4"/>
+              <w:left w:val="single" w:color="BFBFBF" w:sz="4"/>
+              <w:bottom w:val="single" w:color="BFBFBF" w:sz="4"/>
+              <w:right w:val="single" w:color="BFBFBF" w:sz="4"/>
+            </w:tcBorders>
+            <w:shd w:fill="EEF2F8" w:color="auto" w:val="clear"/>
+            <w:tcMar>
+              <w:top w:type="dxa" w:w="60"/>
+              <w:left w:type="dxa" w:w="100"/>
+              <w:bottom w:type="dxa" w:w="60"/>
+              <w:right w:type="dxa" w:w="100"/>
+            </w:tcMar>
+          </w:tcPr>
+          <w:p>
+            <w:r>
+              <w:rPr>
+                <w:rFonts w:ascii="Arial" w:cs="Arial" w:eastAsia="Arial" w:hAnsi="Arial"/>
+                <w:b/>
+                <w:bCs/>
+                <w:sz w:val="18"/>
+                <w:szCs w:val="18"/>
+              </w:rPr>
+              <w:t xml:space="preserve">Не найдено</w:t>
+            </w:r>
+          </w:p>
+        </w:tc>
+        <w:tc>
+          <w:tcPr>
+            <w:tcW w:type="dxa" w:w="7160"/>
+            <w:tcBorders>
+              <w:top w:val="single" w:color="BFBFBF" w:sz="4"/>
+              <w:left w:val="single" w:color="BFBFBF" w:sz="4"/>
+              <w:bottom w:val="single" w:color="BFBFBF" w:sz="4"/>
+              <w:right w:val="single" w:color="BFBFBF" w:sz="4"/>
+            </w:tcBorders>
+            <w:shd w:fill="FCE4D6" w:color="auto" w:val="clear"/>
+            <w:tcMar>
+              <w:top w:type="dxa" w:w="60"/>
+              <w:left w:type="dxa" w:w="100"/>
+              <w:bottom w:type="dxa" w:w="60"/>
+              <w:right w:type="dxa" w:w="100"/>
+            </w:tcMar>
+          </w:tcPr>
+          <w:p>
+            <w:r>
+              <w:rPr>
+                <w:rFonts w:ascii="Arial" w:cs="Arial" w:eastAsia="Arial" w:hAnsi="Arial"/>
+                <w:sz w:val="18"/>
+                <w:szCs w:val="18"/>
+              </w:rPr>
+              <w:t xml:space="preserve">• Независимого подтверждения связи с Archax или Galaxy Digital.</w:t>
+            </w:r>
+          </w:p>
+          <w:p>
+            <w:r>
+              <w:rPr>
+                <w:rFonts w:ascii="Arial" w:cs="Arial" w:eastAsia="Arial" w:hAnsi="Arial"/>
+                <w:sz w:val="18"/>
+                <w:szCs w:val="18"/>
+              </w:rPr>
+              <w:t xml:space="preserve">• Опубликованных кейсов и отзывов клиентов.</w:t>
+            </w:r>
+          </w:p>
+        </w:tc>
+      </w:tr>
+      <w:tr>
+        <w:trPr>
+          <w:cantSplit/>
+          <w:tblHeader w:val="off"/>
+        </w:trPr>
+        <w:tc>
+          <w:tcPr>
+            <w:tcW w:type="dxa" w:w="2200"/>
+            <w:tcBorders>
+              <w:top w:val="single" w:color="BFBFBF" w:sz="4"/>
+              <w:left w:val="single" w:color="BFBFBF" w:sz="4"/>
+              <w:bottom w:val="single" w:color="BFBFBF" w:sz="4"/>
+              <w:right w:val="single" w:color="BFBFBF" w:sz="4"/>
+            </w:tcBorders>
+            <w:shd w:fill="EEF2F8" w:color="auto" w:val="clear"/>
+            <w:tcMar>
+              <w:top w:type="dxa" w:w="60"/>
+              <w:left w:type="dxa" w:w="100"/>
+              <w:bottom w:type="dxa" w:w="60"/>
+              <w:right w:type="dxa" w:w="100"/>
+            </w:tcMar>
+          </w:tcPr>
+          <w:p>
+            <w:r>
+              <w:rPr>
+                <w:rFonts w:ascii="Arial" w:cs="Arial" w:eastAsia="Arial" w:hAnsi="Arial"/>
+                <w:b/>
+                <w:bCs/>
+                <w:sz w:val="18"/>
+                <w:szCs w:val="18"/>
+              </w:rPr>
+              <w:t xml:space="preserve">Вывод</w:t>
+            </w:r>
+          </w:p>
+        </w:tc>
+        <w:tc>
+          <w:tcPr>
+            <w:tcW w:type="dxa" w:w="7160"/>
+            <w:tcBorders>
+              <w:top w:val="single" w:color="BFBFBF" w:sz="4"/>
+              <w:left w:val="single" w:color="BFBFBF" w:sz="4"/>
+              <w:bottom w:val="single" w:color="BFBFBF" w:sz="4"/>
+              <w:right w:val="single" w:color="BFBFBF" w:sz="4"/>
+            </w:tcBorders>
+            <w:tcMar>
+              <w:top w:type="dxa" w:w="60"/>
+              <w:left w:type="dxa" w:w="100"/>
+              <w:bottom w:type="dxa" w:w="60"/>
+              <w:right w:type="dxa" w:w="100"/>
+            </w:tcMar>
+          </w:tcPr>
+          <w:p>
+            <w:r>
+              <w:rPr>
+                <w:rFonts w:ascii="Arial" w:cs="Arial" w:eastAsia="Arial" w:hAnsi="Arial"/>
+                <w:sz w:val="18"/>
+                <w:szCs w:val="18"/>
+              </w:rPr>
+              <w:t xml:space="preserve">Самая подходящая заявленная экспертиза (торговля, исполнение, биржи), но ключевые кейсы не подтверждены, а фирме всего 5 лет. Лидер проекта, похоже, в Гонконге — уточнить, кто будет работать в UK.</w:t>
+            </w:r>
+          </w:p>
+        </w:tc>
+      </w:tr>
+    </w:tbl>
+    <w:p>
+      <w:pPr>
+        <w:pStyle w:val="Heading2"/>
+        <w:keepNext/>
+        <w:spacing w:after="80" w:before="200"/>
+      </w:pPr>
+      <w:r>
+        <w:rPr>
+          <w:rFonts w:ascii="Arial" w:cs="Arial" w:eastAsia="Arial" w:hAnsi="Arial"/>
+          <w:b/>
+          <w:bCs/>
+          <w:color w:val="2F5496"/>
+          <w:sz w:val="22"/>
+          <w:szCs w:val="22"/>
+        </w:rPr>
+        <w:t xml:space="preserve">Fintheo</w:t>
+      </w:r>
+    </w:p>
+    <w:tbl>
+      <w:tblPr>
+        <w:tblW w:type="dxa" w:w="9360"/>
+        <w:tblBorders>
+          <w:top w:val="single" w:color="auto" w:sz="4"/>
+          <w:left w:val="single" w:color="auto" w:sz="4"/>
+          <w:bottom w:val="single" w:color="auto" w:sz="4"/>
+          <w:right w:val="single" w:color="auto" w:sz="4"/>
+          <w:insideH w:val="single" w:color="auto" w:sz="4"/>
+          <w:insideV w:val="single" w:color="auto" w:sz="4"/>
+        </w:tblBorders>
+      </w:tblPr>
+      <w:tblGrid>
+        <w:gridCol w:w="2200"/>
+        <w:gridCol w:w="7160"/>
+      </w:tblGrid>
+      <w:tr>
+        <w:trPr>
+          <w:cantSplit/>
+          <w:tblHeader/>
+        </w:trPr>
+        <w:tc>
+          <w:tcPr>
+            <w:tcW w:type="dxa" w:w="2200"/>
+            <w:tcBorders>
+              <w:top w:val="single" w:color="BFBFBF" w:sz="4"/>
+              <w:left w:val="single" w:color="BFBFBF" w:sz="4"/>
+              <w:bottom w:val="single" w:color="BFBFBF" w:sz="4"/>
+              <w:right w:val="single" w:color="BFBFBF" w:sz="4"/>
+            </w:tcBorders>
+            <w:shd w:fill="1F3864" w:color="auto" w:val="clear"/>
+            <w:tcMar>
+              <w:top w:type="dxa" w:w="60"/>
+              <w:left w:type="dxa" w:w="100"/>
+              <w:bottom w:type="dxa" w:w="60"/>
+              <w:right w:type="dxa" w:w="100"/>
+            </w:tcMar>
+          </w:tcPr>
+          <w:p>
+            <w:r>
+              <w:rPr>
+                <w:rFonts w:ascii="Arial" w:cs="Arial" w:eastAsia="Arial" w:hAnsi="Arial"/>
+                <w:b/>
+                <w:bCs/>
+                <w:color w:val="FFFFFF"/>
+                <w:sz w:val="18"/>
+                <w:szCs w:val="18"/>
+              </w:rPr>
+              <w:t xml:space="preserve"/>
+            </w:r>
+          </w:p>
+        </w:tc>
+        <w:tc>
+          <w:tcPr>
+            <w:tcW w:type="dxa" w:w="7160"/>
+            <w:tcBorders>
+              <w:top w:val="single" w:color="BFBFBF" w:sz="4"/>
+              <w:left w:val="single" w:color="BFBFBF" w:sz="4"/>
+              <w:bottom w:val="single" w:color="BFBFBF" w:sz="4"/>
+              <w:right w:val="single" w:color="BFBFBF" w:sz="4"/>
+            </w:tcBorders>
+            <w:shd w:fill="1F3864" w:color="auto" w:val="clear"/>
+            <w:tcMar>
+              <w:top w:type="dxa" w:w="60"/>
+              <w:left w:type="dxa" w:w="100"/>
+              <w:bottom w:type="dxa" w:w="60"/>
+              <w:right w:type="dxa" w:w="100"/>
+            </w:tcMar>
+          </w:tcPr>
+          <w:p>
+            <w:r>
+              <w:rPr>
+                <w:rFonts w:ascii="Arial" w:cs="Arial" w:eastAsia="Arial" w:hAnsi="Arial"/>
+                <w:b/>
+                <w:bCs/>
+                <w:color w:val="FFFFFF"/>
+                <w:sz w:val="18"/>
+                <w:szCs w:val="18"/>
+              </w:rPr>
+              <w:t xml:space="preserve">Что нашли</w:t>
+            </w:r>
+          </w:p>
+        </w:tc>
+      </w:tr>
+      <w:tr>
+        <w:trPr>
+          <w:cantSplit/>
+          <w:tblHeader w:val="off"/>
+        </w:trPr>
+        <w:tc>
+          <w:tcPr>
+            <w:tcW w:type="dxa" w:w="2200"/>
+            <w:tcBorders>
+              <w:top w:val="single" w:color="BFBFBF" w:sz="4"/>
+              <w:left w:val="single" w:color="BFBFBF" w:sz="4"/>
+              <w:bottom w:val="single" w:color="BFBFBF" w:sz="4"/>
+              <w:right w:val="single" w:color="BFBFBF" w:sz="4"/>
+            </w:tcBorders>
+            <w:shd w:fill="EEF2F8" w:color="auto" w:val="clear"/>
+            <w:tcMar>
+              <w:top w:type="dxa" w:w="60"/>
+              <w:left w:type="dxa" w:w="100"/>
+              <w:bottom w:type="dxa" w:w="60"/>
+              <w:right w:type="dxa" w:w="100"/>
+            </w:tcMar>
+          </w:tcPr>
+          <w:p>
+            <w:r>
+              <w:rPr>
+                <w:rFonts w:ascii="Arial" w:cs="Arial" w:eastAsia="Arial" w:hAnsi="Arial"/>
+                <w:b/>
+                <w:bCs/>
+                <w:sz w:val="18"/>
+                <w:szCs w:val="18"/>
+              </w:rPr>
+              <w:t xml:space="preserve">Подтверждено</w:t>
+            </w:r>
+          </w:p>
+        </w:tc>
+        <w:tc>
+          <w:tcPr>
+            <w:tcW w:type="dxa" w:w="7160"/>
+            <w:tcBorders>
+              <w:top w:val="single" w:color="BFBFBF" w:sz="4"/>
+              <w:left w:val="single" w:color="BFBFBF" w:sz="4"/>
+              <w:bottom w:val="single" w:color="BFBFBF" w:sz="4"/>
+              <w:right w:val="single" w:color="BFBFBF" w:sz="4"/>
+            </w:tcBorders>
+            <w:shd w:fill="E2EFDA" w:color="auto" w:val="clear"/>
+            <w:tcMar>
+              <w:top w:type="dxa" w:w="60"/>
+              <w:left w:type="dxa" w:w="100"/>
+              <w:bottom w:type="dxa" w:w="60"/>
+              <w:right w:type="dxa" w:w="100"/>
+            </w:tcMar>
+          </w:tcPr>
+          <w:p>
+            <w:r>
+              <w:rPr>
+                <w:rFonts w:ascii="Arial" w:cs="Arial" w:eastAsia="Arial" w:hAnsi="Arial"/>
+                <w:sz w:val="18"/>
+                <w:szCs w:val="18"/>
+              </w:rPr>
+              <w:t xml:space="preserve">• Группа зарегистрирована в Companies House: Fintheo Group Holding Ltd и Fintheo Consulting Ltd — февраль 2024, Middleton (Манчестер). Связанная Fintheo Technology Ltd — с 2019 (бывшая SpaceFEX), в реестре сейчас под другим названием.</w:t>
+            </w:r>
+          </w:p>
+          <w:p>
+            <w:r>
+              <w:rPr>
+                <w:rFonts w:ascii="Arial" w:cs="Arial" w:eastAsia="Arial" w:hAnsi="Arial"/>
+                <w:sz w:val="18"/>
+                <w:szCs w:val="18"/>
+              </w:rPr>
+              <w:t xml:space="preserve">• Один кейс с отзывом клиента: EMI-лицензия FCA для PAYLER за 5 месяцев.</w:t>
+            </w:r>
+          </w:p>
+        </w:tc>
+      </w:tr>
+      <w:tr>
+        <w:trPr>
+          <w:cantSplit/>
+          <w:tblHeader w:val="off"/>
+        </w:trPr>
+        <w:tc>
+          <w:tcPr>
+            <w:tcW w:type="dxa" w:w="2200"/>
+            <w:tcBorders>
+              <w:top w:val="single" w:color="BFBFBF" w:sz="4"/>
+              <w:left w:val="single" w:color="BFBFBF" w:sz="4"/>
+              <w:bottom w:val="single" w:color="BFBFBF" w:sz="4"/>
+              <w:right w:val="single" w:color="BFBFBF" w:sz="4"/>
+            </w:tcBorders>
+            <w:shd w:fill="EEF2F8" w:color="auto" w:val="clear"/>
+            <w:tcMar>
+              <w:top w:type="dxa" w:w="60"/>
+              <w:left w:type="dxa" w:w="100"/>
+              <w:bottom w:type="dxa" w:w="60"/>
+              <w:right w:type="dxa" w:w="100"/>
+            </w:tcMar>
+          </w:tcPr>
+          <w:p>
+            <w:r>
+              <w:rPr>
+                <w:rFonts w:ascii="Arial" w:cs="Arial" w:eastAsia="Arial" w:hAnsi="Arial"/>
+                <w:b/>
+                <w:bCs/>
+                <w:sz w:val="18"/>
+                <w:szCs w:val="18"/>
+              </w:rPr>
+              <w:t xml:space="preserve">Заявлено</w:t>
+            </w:r>
+          </w:p>
+        </w:tc>
+        <w:tc>
+          <w:tcPr>
+            <w:tcW w:type="dxa" w:w="7160"/>
+            <w:tcBorders>
+              <w:top w:val="single" w:color="BFBFBF" w:sz="4"/>
+              <w:left w:val="single" w:color="BFBFBF" w:sz="4"/>
+              <w:bottom w:val="single" w:color="BFBFBF" w:sz="4"/>
+              <w:right w:val="single" w:color="BFBFBF" w:sz="4"/>
+            </w:tcBorders>
+            <w:shd w:fill="FFF2CC" w:color="auto" w:val="clear"/>
+            <w:tcMar>
+              <w:top w:type="dxa" w:w="60"/>
+              <w:left w:type="dxa" w:w="100"/>
+              <w:bottom w:type="dxa" w:w="60"/>
+              <w:right w:type="dxa" w:w="100"/>
+            </w:tcMar>
+          </w:tcPr>
+          <w:p>
+            <w:r>
+              <w:rPr>
+                <w:rFonts w:ascii="Arial" w:cs="Arial" w:eastAsia="Arial" w:hAnsi="Arial"/>
+                <w:sz w:val="18"/>
+                <w:szCs w:val="18"/>
+              </w:rPr>
+              <w:t xml:space="preserve">• 41 лицензия, 0 отказов, 6+ лет — в основном EMI, платёжные компании, ЕС.</w:t>
+            </w:r>
+          </w:p>
+          <w:p>
+            <w:r>
+              <w:rPr>
+                <w:rFonts w:ascii="Arial" w:cs="Arial" w:eastAsia="Arial" w:hAnsi="Arial"/>
+                <w:sz w:val="18"/>
+                <w:szCs w:val="18"/>
+              </w:rPr>
+              <w:t xml:space="preserve">• «Crypto licences» и MiCA в перечне услуг; «гарантированный результат» — маркетинг, регулятор результат не гарантирует.</w:t>
+            </w:r>
+          </w:p>
+          <w:p>
+            <w:r>
+              <w:rPr>
+                <w:rFonts w:ascii="Arial" w:cs="Arial" w:eastAsia="Arial" w:hAnsi="Arial"/>
+                <w:sz w:val="18"/>
+                <w:szCs w:val="18"/>
+              </w:rPr>
+              <w:t xml:space="preserve">• Eugene Sadovsky — в открытых источниках не найден.</w:t>
+            </w:r>
+          </w:p>
+        </w:tc>
+      </w:tr>
+      <w:tr>
+        <w:trPr>
+          <w:cantSplit/>
+          <w:tblHeader w:val="off"/>
+        </w:trPr>
+        <w:tc>
+          <w:tcPr>
+            <w:tcW w:type="dxa" w:w="2200"/>
+            <w:tcBorders>
+              <w:top w:val="single" w:color="BFBFBF" w:sz="4"/>
+              <w:left w:val="single" w:color="BFBFBF" w:sz="4"/>
+              <w:bottom w:val="single" w:color="BFBFBF" w:sz="4"/>
+              <w:right w:val="single" w:color="BFBFBF" w:sz="4"/>
+            </w:tcBorders>
+            <w:shd w:fill="EEF2F8" w:color="auto" w:val="clear"/>
+            <w:tcMar>
+              <w:top w:type="dxa" w:w="60"/>
+              <w:left w:type="dxa" w:w="100"/>
+              <w:bottom w:type="dxa" w:w="60"/>
+              <w:right w:type="dxa" w:w="100"/>
+            </w:tcMar>
+          </w:tcPr>
+          <w:p>
+            <w:r>
+              <w:rPr>
+                <w:rFonts w:ascii="Arial" w:cs="Arial" w:eastAsia="Arial" w:hAnsi="Arial"/>
+                <w:b/>
+                <w:bCs/>
+                <w:sz w:val="18"/>
+                <w:szCs w:val="18"/>
+              </w:rPr>
+              <w:t xml:space="preserve">Не найдено</w:t>
+            </w:r>
+          </w:p>
+        </w:tc>
+        <w:tc>
+          <w:tcPr>
+            <w:tcW w:type="dxa" w:w="7160"/>
+            <w:tcBorders>
+              <w:top w:val="single" w:color="BFBFBF" w:sz="4"/>
+              <w:left w:val="single" w:color="BFBFBF" w:sz="4"/>
+              <w:bottom w:val="single" w:color="BFBFBF" w:sz="4"/>
+              <w:right w:val="single" w:color="BFBFBF" w:sz="4"/>
+            </w:tcBorders>
+            <w:shd w:fill="FCE4D6" w:color="auto" w:val="clear"/>
+            <w:tcMar>
+              <w:top w:type="dxa" w:w="60"/>
+              <w:left w:type="dxa" w:w="100"/>
+              <w:bottom w:type="dxa" w:w="60"/>
+              <w:right w:type="dxa" w:w="100"/>
+            </w:tcMar>
+          </w:tcPr>
+          <w:p>
+            <w:r>
+              <w:rPr>
+                <w:rFonts w:ascii="Arial" w:cs="Arial" w:eastAsia="Arial" w:hAnsi="Arial"/>
+                <w:sz w:val="18"/>
+                <w:szCs w:val="18"/>
+              </w:rPr>
+              <w:t xml:space="preserve">• Ни одного крипто-клиента (ни FCA, ни MiCA).</w:t>
+            </w:r>
+          </w:p>
+          <w:p>
+            <w:r>
+              <w:rPr>
+                <w:rFonts w:ascii="Arial" w:cs="Arial" w:eastAsia="Arial" w:hAnsi="Arial"/>
+                <w:sz w:val="18"/>
+                <w:szCs w:val="18"/>
+              </w:rPr>
+              <w:t xml:space="preserve">• Имён команды и их опыта.</w:t>
+            </w:r>
+          </w:p>
+        </w:tc>
+      </w:tr>
+      <w:tr>
+        <w:trPr>
+          <w:cantSplit/>
+          <w:tblHeader w:val="off"/>
+        </w:trPr>
+        <w:tc>
+          <w:tcPr>
+            <w:tcW w:type="dxa" w:w="2200"/>
+            <w:tcBorders>
+              <w:top w:val="single" w:color="BFBFBF" w:sz="4"/>
+              <w:left w:val="single" w:color="BFBFBF" w:sz="4"/>
+              <w:bottom w:val="single" w:color="BFBFBF" w:sz="4"/>
+              <w:right w:val="single" w:color="BFBFBF" w:sz="4"/>
+            </w:tcBorders>
+            <w:shd w:fill="EEF2F8" w:color="auto" w:val="clear"/>
+            <w:tcMar>
+              <w:top w:type="dxa" w:w="60"/>
+              <w:left w:type="dxa" w:w="100"/>
+              <w:bottom w:type="dxa" w:w="60"/>
+              <w:right w:type="dxa" w:w="100"/>
+            </w:tcMar>
+          </w:tcPr>
+          <w:p>
+            <w:r>
+              <w:rPr>
+                <w:rFonts w:ascii="Arial" w:cs="Arial" w:eastAsia="Arial" w:hAnsi="Arial"/>
+                <w:b/>
+                <w:bCs/>
+                <w:sz w:val="18"/>
+                <w:szCs w:val="18"/>
+              </w:rPr>
+              <w:t xml:space="preserve">Вывод</w:t>
+            </w:r>
+          </w:p>
+        </w:tc>
+        <w:tc>
+          <w:tcPr>
+            <w:tcW w:type="dxa" w:w="7160"/>
+            <w:tcBorders>
+              <w:top w:val="single" w:color="BFBFBF" w:sz="4"/>
+              <w:left w:val="single" w:color="BFBFBF" w:sz="4"/>
+              <w:bottom w:val="single" w:color="BFBFBF" w:sz="4"/>
+              <w:right w:val="single" w:color="BFBFBF" w:sz="4"/>
+            </w:tcBorders>
+            <w:tcMar>
+              <w:top w:type="dxa" w:w="60"/>
+              <w:left w:type="dxa" w:w="100"/>
+              <w:bottom w:type="dxa" w:w="60"/>
+              <w:right w:type="dxa" w:w="100"/>
+            </w:tcMar>
+          </w:tcPr>
+          <w:p>
+            <w:r>
+              <w:rPr>
+                <w:rFonts w:ascii="Arial" w:cs="Arial" w:eastAsia="Arial" w:hAnsi="Arial"/>
+                <w:sz w:val="18"/>
+                <w:szCs w:val="18"/>
+              </w:rPr>
+              <w:t xml:space="preserve">Подтверждённый опыт — платёжные и EMI-лицензии. Крипто-опыта не видно, юрлицо — с 2024 года. Хорошее понимание нового режима в оффере — ещё не практика.</w:t>
+            </w:r>
+          </w:p>
+        </w:tc>
+      </w:tr>
+    </w:tbl>
+    <w:p>
+      <w:pPr>
+        <w:pStyle w:val="Heading2"/>
+        <w:keepNext/>
+        <w:spacing w:after="80" w:before="200"/>
+      </w:pPr>
+      <w:r>
+        <w:rPr>
+          <w:rFonts w:ascii="Arial" w:cs="Arial" w:eastAsia="Arial" w:hAnsi="Arial"/>
+          <w:b/>
+          <w:bCs/>
+          <w:color w:val="2F5496"/>
+          <w:sz w:val="22"/>
+          <w:szCs w:val="22"/>
+        </w:rPr>
+        <w:t xml:space="preserve">Итог по опыту в крипте</w:t>
+      </w:r>
+    </w:p>
+    <w:p>
+      <w:pPr>
+        <w:pStyle w:val="ListParagraph"/>
+        <w:numPr>
+          <w:ilvl w:val="0"/>
+          <w:numId w:val="2"/>
+        </w:numPr>
+        <w:spacing w:after="50"/>
+      </w:pPr>
+      <w:r>
+        <w:rPr>
+          <w:rFonts w:ascii="Arial" w:cs="Arial" w:eastAsia="Arial" w:hAnsi="Arial"/>
+          <w:b/>
+          <w:bCs/>
+          <w:sz w:val="20"/>
+          <w:szCs w:val="20"/>
+        </w:rPr>
+        <w:t xml:space="preserve">Ни у одной фирмы нет подтверждённого внешнего клиента, проведённого через FCA-авторизацию в крипте. </w:t>
+      </w:r>
+      <w:r>
+        <w:rPr>
+          <w:rFonts w:ascii="Arial" w:cs="Arial" w:eastAsia="Arial" w:hAnsi="Arial"/>
+          <w:sz w:val="20"/>
+          <w:szCs w:val="20"/>
+        </w:rPr>
+        <w:t xml:space="preserve">Это нормально — новый режим только открылся, — но значит, что решающими будут люди, а не бренд.</w:t>
+      </w:r>
+    </w:p>
+    <w:p>
+      <w:pPr>
+        <w:pStyle w:val="ListParagraph"/>
+        <w:numPr>
+          <w:ilvl w:val="0"/>
+          <w:numId w:val="2"/>
+        </w:numPr>
+        <w:spacing w:after="50"/>
+      </w:pPr>
+      <w:r>
+        <w:rPr>
+          <w:rFonts w:ascii="Arial" w:cs="Arial" w:eastAsia="Arial" w:hAnsi="Arial"/>
+          <w:sz w:val="20"/>
+          <w:szCs w:val="20"/>
+        </w:rPr>
+        <w:t xml:space="preserve">Ближе всех к нашей модели (OTC, исполнение сделок) — ComplyCraft, но их кейсы нужно подтвердить.</w:t>
+      </w:r>
+    </w:p>
+    <w:p>
+      <w:pPr>
+        <w:pStyle w:val="ListParagraph"/>
+        <w:numPr>
+          <w:ilvl w:val="0"/>
+          <w:numId w:val="2"/>
+        </w:numPr>
+        <w:spacing w:after="50"/>
+      </w:pPr>
+      <w:r>
+        <w:rPr>
+          <w:rFonts w:ascii="Arial" w:cs="Arial" w:eastAsia="Arial" w:hAnsi="Arial"/>
+          <w:b/>
+          <w:bCs/>
+          <w:sz w:val="20"/>
+          <w:szCs w:val="20"/>
+        </w:rPr>
+        <w:t xml:space="preserve">На финальных звонках попросить у всех: </w:t>
+      </w:r>
+      <w:r>
+        <w:rPr>
+          <w:rFonts w:ascii="Arial" w:cs="Arial" w:eastAsia="Arial" w:hAnsi="Arial"/>
+          <w:sz w:val="20"/>
+          <w:szCs w:val="20"/>
+        </w:rPr>
+        <w:t xml:space="preserve">2–3 крипто-клиента с контактами для рекомендаций (references), CV и местонахождение людей, которые будут вести Hypergate.</w:t>
       </w:r>
     </w:p>
     <w:p>

</xml_diff>